<commit_message>
Documenta configuraciones de Dask en informe y presentación
</commit_message>
<xml_diff>
--- a/INFORME_FINAL_Procesos_CRISP_DM.docx
+++ b/INFORME_FINAL_Procesos_CRISP_DM.docx
@@ -2673,6 +2673,12 @@
       </w:r>
     </w:p>
     <w:p>
+      <w:pPr/>
+      <w:r>
+        <w:t>En ambas configuraciones ejecutamos cada worker como proceso independiente (processes=True) y asignamos un hilo por proceso (threads_per_worker=1). La memoria indicada es el límite configurado para cada proceso worker.</w:t>
+      </w:r>
+    </w:p>
+    <w:p>
       <w:pPr>
         <w:keepNext/>
         <w:spacing w:line="480" w:lineRule="auto" w:after="80"/>
@@ -2728,17 +2734,7 @@
             <w:vAlign w:val="center"/>
           </w:tcPr>
           <w:p>
-            <w:pPr>
-              <w:spacing w:line="264" w:lineRule="auto" w:after="0"/>
-              <w:ind w:firstLine="0"/>
-            </w:pPr>
             <w:r>
-              <w:rPr>
-                <w:rFonts w:ascii="Times New Roman" w:hAnsi="Times New Roman" w:eastAsia="Times New Roman"/>
-                <w:b/>
-                <w:color w:val="000000"/>
-                <w:sz w:val="17"/>
-              </w:rPr>
               <w:t>Configuración</w:t>
             </w:r>
           </w:p>
@@ -2749,18 +2745,8 @@
             <w:vAlign w:val="center"/>
           </w:tcPr>
           <w:p>
-            <w:pPr>
-              <w:spacing w:line="264" w:lineRule="auto" w:after="0"/>
-              <w:ind w:firstLine="0"/>
-            </w:pPr>
             <w:r>
-              <w:rPr>
-                <w:rFonts w:ascii="Times New Roman" w:hAnsi="Times New Roman" w:eastAsia="Times New Roman"/>
-                <w:b/>
-                <w:color w:val="000000"/>
-                <w:sz w:val="17"/>
-              </w:rPr>
-              <w:t>Workers</w:t>
+              <w:t>Procesos worker</w:t>
             </w:r>
           </w:p>
         </w:tc>
@@ -2770,18 +2756,8 @@
             <w:vAlign w:val="center"/>
           </w:tcPr>
           <w:p>
-            <w:pPr>
-              <w:spacing w:line="264" w:lineRule="auto" w:after="0"/>
-              <w:ind w:firstLine="0"/>
-            </w:pPr>
             <w:r>
-              <w:rPr>
-                <w:rFonts w:ascii="Times New Roman" w:hAnsi="Times New Roman" w:eastAsia="Times New Roman"/>
-                <w:b/>
-                <w:color w:val="000000"/>
-                <w:sz w:val="17"/>
-              </w:rPr>
-              <w:t>Memoria por worker</w:t>
+              <w:t>Hilos por proceso</w:t>
             </w:r>
           </w:p>
         </w:tc>
@@ -2791,17 +2767,18 @@
             <w:vAlign w:val="center"/>
           </w:tcPr>
           <w:p>
-            <w:pPr>
-              <w:spacing w:line="264" w:lineRule="auto" w:after="0"/>
-              <w:ind w:firstLine="0"/>
-            </w:pPr>
             <w:r>
-              <w:rPr>
-                <w:rFonts w:ascii="Times New Roman" w:hAnsi="Times New Roman" w:eastAsia="Times New Roman"/>
-                <w:b/>
-                <w:color w:val="000000"/>
-                <w:sz w:val="17"/>
-              </w:rPr>
+              <w:t>Memoria por proceso worker</w:t>
+            </w:r>
+          </w:p>
+        </w:tc>
+        <w:tc>
+          <w:tcPr>
+            <w:tcW w:type="dxa" w:w="1632"/>
+            <w:vAlign w:val="center"/>
+          </w:tcPr>
+          <w:p>
+            <w:r>
               <w:t>Mediana</w:t>
             </w:r>
           </w:p>
@@ -2812,39 +2789,8 @@
             <w:vAlign w:val="center"/>
           </w:tcPr>
           <w:p>
-            <w:pPr>
-              <w:spacing w:line="264" w:lineRule="auto" w:after="0"/>
-              <w:ind w:firstLine="0"/>
-            </w:pPr>
             <w:r>
-              <w:rPr>
-                <w:rFonts w:ascii="Times New Roman" w:hAnsi="Times New Roman" w:eastAsia="Times New Roman"/>
-                <w:b/>
-                <w:color w:val="000000"/>
-                <w:sz w:val="17"/>
-              </w:rPr>
               <w:t>Rango</w:t>
-            </w:r>
-          </w:p>
-        </w:tc>
-        <w:tc>
-          <w:tcPr>
-            <w:tcW w:type="dxa" w:w="1632"/>
-            <w:vAlign w:val="center"/>
-          </w:tcPr>
-          <w:p>
-            <w:pPr>
-              <w:spacing w:line="264" w:lineRule="auto" w:after="0"/>
-              <w:ind w:firstLine="0"/>
-            </w:pPr>
-            <w:r>
-              <w:rPr>
-                <w:rFonts w:ascii="Times New Roman" w:hAnsi="Times New Roman" w:eastAsia="Times New Roman"/>
-                <w:b/>
-                <w:color w:val="000000"/>
-                <w:sz w:val="17"/>
-              </w:rPr>
-              <w:t>Resultado</w:t>
             </w:r>
           </w:p>
         </w:tc>
@@ -2856,16 +2802,7 @@
             <w:vAlign w:val="center"/>
           </w:tcPr>
           <w:p>
-            <w:pPr>
-              <w:spacing w:after="0" w:line="264" w:lineRule="auto"/>
-              <w:ind w:firstLine="0"/>
-            </w:pPr>
             <w:r>
-              <w:rPr>
-                <w:rFonts w:ascii="Times New Roman" w:hAnsi="Times New Roman" w:eastAsia="Times New Roman"/>
-                <w:color w:val="000000"/>
-                <w:sz w:val="17"/>
-              </w:rPr>
               <w:t>A</w:t>
             </w:r>
           </w:p>
@@ -2876,16 +2813,7 @@
             <w:vAlign w:val="center"/>
           </w:tcPr>
           <w:p>
-            <w:pPr>
-              <w:spacing w:after="0" w:line="264" w:lineRule="auto"/>
-              <w:ind w:firstLine="0"/>
-            </w:pPr>
             <w:r>
-              <w:rPr>
-                <w:rFonts w:ascii="Times New Roman" w:hAnsi="Times New Roman" w:eastAsia="Times New Roman"/>
-                <w:color w:val="000000"/>
-                <w:sz w:val="17"/>
-              </w:rPr>
               <w:t>1</w:t>
             </w:r>
           </w:p>
@@ -2896,16 +2824,18 @@
             <w:vAlign w:val="center"/>
           </w:tcPr>
           <w:p>
-            <w:pPr>
-              <w:spacing w:after="0" w:line="264" w:lineRule="auto"/>
-              <w:ind w:firstLine="0"/>
-            </w:pPr>
             <w:r>
-              <w:rPr>
-                <w:rFonts w:ascii="Times New Roman" w:hAnsi="Times New Roman" w:eastAsia="Times New Roman"/>
-                <w:color w:val="000000"/>
-                <w:sz w:val="17"/>
-              </w:rPr>
+              <w:t>1</w:t>
+            </w:r>
+          </w:p>
+        </w:tc>
+        <w:tc>
+          <w:tcPr>
+            <w:tcW w:type="dxa" w:w="1632"/>
+            <w:vAlign w:val="center"/>
+          </w:tcPr>
+          <w:p>
+            <w:r>
               <w:t>1 GiB</w:t>
             </w:r>
           </w:p>
@@ -2916,16 +2846,7 @@
             <w:vAlign w:val="center"/>
           </w:tcPr>
           <w:p>
-            <w:pPr>
-              <w:spacing w:after="0" w:line="264" w:lineRule="auto"/>
-              <w:ind w:firstLine="0"/>
-            </w:pPr>
             <w:r>
-              <w:rPr>
-                <w:rFonts w:ascii="Times New Roman" w:hAnsi="Times New Roman" w:eastAsia="Times New Roman"/>
-                <w:color w:val="000000"/>
-                <w:sz w:val="17"/>
-              </w:rPr>
               <w:t>21,656 s</w:t>
             </w:r>
           </w:p>
@@ -2936,37 +2857,8 @@
             <w:vAlign w:val="center"/>
           </w:tcPr>
           <w:p>
-            <w:pPr>
-              <w:spacing w:after="0" w:line="264" w:lineRule="auto"/>
-              <w:ind w:firstLine="0"/>
-            </w:pPr>
             <w:r>
-              <w:rPr>
-                <w:rFonts w:ascii="Times New Roman" w:hAnsi="Times New Roman" w:eastAsia="Times New Roman"/>
-                <w:color w:val="000000"/>
-                <w:sz w:val="17"/>
-              </w:rPr>
               <w:t>21,622–22,577 s</w:t>
-            </w:r>
-          </w:p>
-        </w:tc>
-        <w:tc>
-          <w:tcPr>
-            <w:tcW w:type="dxa" w:w="1632"/>
-            <w:vAlign w:val="center"/>
-          </w:tcPr>
-          <w:p>
-            <w:pPr>
-              <w:spacing w:after="0" w:line="264" w:lineRule="auto"/>
-              <w:ind w:firstLine="0"/>
-            </w:pPr>
-            <w:r>
-              <w:rPr>
-                <w:rFonts w:ascii="Times New Roman" w:hAnsi="Times New Roman" w:eastAsia="Times New Roman"/>
-                <w:color w:val="000000"/>
-                <w:sz w:val="17"/>
-              </w:rPr>
-              <w:t>Mismo conjunto y grupos</w:t>
             </w:r>
           </w:p>
         </w:tc>
@@ -2978,16 +2870,7 @@
             <w:vAlign w:val="center"/>
           </w:tcPr>
           <w:p>
-            <w:pPr>
-              <w:spacing w:after="0" w:line="264" w:lineRule="auto"/>
-              <w:ind w:firstLine="0"/>
-            </w:pPr>
             <w:r>
-              <w:rPr>
-                <w:rFonts w:ascii="Times New Roman" w:hAnsi="Times New Roman" w:eastAsia="Times New Roman"/>
-                <w:color w:val="000000"/>
-                <w:sz w:val="17"/>
-              </w:rPr>
               <w:t>B</w:t>
             </w:r>
           </w:p>
@@ -2998,16 +2881,7 @@
             <w:vAlign w:val="center"/>
           </w:tcPr>
           <w:p>
-            <w:pPr>
-              <w:spacing w:after="0" w:line="264" w:lineRule="auto"/>
-              <w:ind w:firstLine="0"/>
-            </w:pPr>
             <w:r>
-              <w:rPr>
-                <w:rFonts w:ascii="Times New Roman" w:hAnsi="Times New Roman" w:eastAsia="Times New Roman"/>
-                <w:color w:val="000000"/>
-                <w:sz w:val="17"/>
-              </w:rPr>
               <w:t>2</w:t>
             </w:r>
           </w:p>
@@ -3018,16 +2892,18 @@
             <w:vAlign w:val="center"/>
           </w:tcPr>
           <w:p>
-            <w:pPr>
-              <w:spacing w:after="0" w:line="264" w:lineRule="auto"/>
-              <w:ind w:firstLine="0"/>
-            </w:pPr>
             <w:r>
-              <w:rPr>
-                <w:rFonts w:ascii="Times New Roman" w:hAnsi="Times New Roman" w:eastAsia="Times New Roman"/>
-                <w:color w:val="000000"/>
-                <w:sz w:val="17"/>
-              </w:rPr>
+              <w:t>1</w:t>
+            </w:r>
+          </w:p>
+        </w:tc>
+        <w:tc>
+          <w:tcPr>
+            <w:tcW w:type="dxa" w:w="1632"/>
+            <w:vAlign w:val="center"/>
+          </w:tcPr>
+          <w:p>
+            <w:r>
               <w:t>512 MiB</w:t>
             </w:r>
           </w:p>
@@ -3038,16 +2914,7 @@
             <w:vAlign w:val="center"/>
           </w:tcPr>
           <w:p>
-            <w:pPr>
-              <w:spacing w:after="0" w:line="264" w:lineRule="auto"/>
-              <w:ind w:firstLine="0"/>
-            </w:pPr>
             <w:r>
-              <w:rPr>
-                <w:rFonts w:ascii="Times New Roman" w:hAnsi="Times New Roman" w:eastAsia="Times New Roman"/>
-                <w:color w:val="000000"/>
-                <w:sz w:val="17"/>
-              </w:rPr>
               <w:t>10,568 s</w:t>
             </w:r>
           </w:p>
@@ -3058,37 +2925,8 @@
             <w:vAlign w:val="center"/>
           </w:tcPr>
           <w:p>
-            <w:pPr>
-              <w:spacing w:after="0" w:line="264" w:lineRule="auto"/>
-              <w:ind w:firstLine="0"/>
-            </w:pPr>
             <w:r>
-              <w:rPr>
-                <w:rFonts w:ascii="Times New Roman" w:hAnsi="Times New Roman" w:eastAsia="Times New Roman"/>
-                <w:color w:val="000000"/>
-                <w:sz w:val="17"/>
-              </w:rPr>
               <w:t>8,227–11,118 s</w:t>
-            </w:r>
-          </w:p>
-        </w:tc>
-        <w:tc>
-          <w:tcPr>
-            <w:tcW w:type="dxa" w:w="1632"/>
-            <w:vAlign w:val="center"/>
-          </w:tcPr>
-          <w:p>
-            <w:pPr>
-              <w:spacing w:after="0" w:line="264" w:lineRule="auto"/>
-              <w:ind w:firstLine="0"/>
-            </w:pPr>
-            <w:r>
-              <w:rPr>
-                <w:rFonts w:ascii="Times New Roman" w:hAnsi="Times New Roman" w:eastAsia="Times New Roman"/>
-                <w:color w:val="000000"/>
-                <w:sz w:val="17"/>
-              </w:rPr>
-              <w:t>Mismo conjunto y grupos</w:t>
             </w:r>
           </w:p>
         </w:tc>

</xml_diff>